<commit_message>
docs(er-diagram): restructure MER and class diagram for updated system design
</commit_message>
<xml_diff>
--- a/Informe tecnico/INFORME TECNICO (1) (1).docx
+++ b/Informe tecnico/INFORME TECNICO (1) (1).docx
@@ -22,7 +22,9 @@
         <w:rPr>
           <w:rFonts w:ascii="Aptos" w:cs="Aptos" w:eastAsia="Aptos" w:hAnsi="Aptos"/>
           <w:b w:val="0"/>
+          <w:bCs w:val="0"/>
           <w:i w:val="0"/>
+          <w:iCs w:val="0"/>
           <w:smallCaps w:val="0"/>
           <w:strike w:val="0"/>
           <w:color w:val="156082"/>
@@ -37,7 +39,9 @@
         <w:rPr>
           <w:rFonts w:ascii="Aptos" w:cs="Aptos" w:eastAsia="Aptos" w:hAnsi="Aptos"/>
           <w:b w:val="0"/>
+          <w:bCs w:val="0"/>
           <w:i w:val="0"/>
+          <w:iCs w:val="0"/>
           <w:smallCaps w:val="0"/>
           <w:strike w:val="0"/>
           <w:color w:val="156082"/>
@@ -51,12 +55,12 @@
           <wp:inline distB="0" distT="0" distL="0" distR="0">
             <wp:extent cx="1417320" cy="750898"/>
             <wp:effectExtent b="0" l="0" r="0" t="0"/>
-            <wp:docPr id="146" name="image1.png"/>
+            <wp:docPr id="146" name="image2.png"/>
             <a:graphic>
               <a:graphicData uri="http://schemas.openxmlformats.org/drawingml/2006/picture">
                 <pic:pic>
                   <pic:nvPicPr>
-                    <pic:cNvPr id="0" name="image1.png"/>
+                    <pic:cNvPr id="0" name="image2.png"/>
                     <pic:cNvPicPr preferRelativeResize="0"/>
                   </pic:nvPicPr>
                   <pic:blipFill>
@@ -106,7 +110,9 @@
         <w:rPr>
           <w:rFonts w:ascii="Play" w:cs="Play" w:eastAsia="Play" w:hAnsi="Play"/>
           <w:b w:val="0"/>
+          <w:bCs w:val="0"/>
           <w:i w:val="0"/>
+          <w:iCs w:val="0"/>
           <w:smallCaps w:val="1"/>
           <w:strike w:val="0"/>
           <w:color w:val="156082"/>
@@ -121,7 +127,9 @@
         <w:rPr>
           <w:rFonts w:ascii="Play" w:cs="Play" w:eastAsia="Play" w:hAnsi="Play"/>
           <w:b w:val="0"/>
+          <w:bCs w:val="0"/>
           <w:i w:val="0"/>
+          <w:iCs w:val="0"/>
           <w:smallCaps w:val="1"/>
           <w:strike w:val="0"/>
           <w:color w:val="156082"/>
@@ -160,7 +168,9 @@
         <w:rPr>
           <w:rFonts w:ascii="Aptos" w:cs="Aptos" w:eastAsia="Aptos" w:hAnsi="Aptos"/>
           <w:b w:val="0"/>
+          <w:bCs w:val="0"/>
           <w:i w:val="0"/>
+          <w:iCs w:val="0"/>
           <w:smallCaps w:val="0"/>
           <w:strike w:val="0"/>
           <w:color w:val="156082"/>
@@ -175,7 +185,9 @@
         <w:rPr>
           <w:rFonts w:ascii="Aptos" w:cs="Aptos" w:eastAsia="Aptos" w:hAnsi="Aptos"/>
           <w:b w:val="0"/>
+          <w:bCs w:val="0"/>
           <w:i w:val="0"/>
+          <w:iCs w:val="0"/>
           <w:smallCaps w:val="0"/>
           <w:strike w:val="0"/>
           <w:color w:val="156082"/>
@@ -209,7 +221,9 @@
         <w:rPr>
           <w:rFonts w:ascii="Aptos" w:cs="Aptos" w:eastAsia="Aptos" w:hAnsi="Aptos"/>
           <w:b w:val="0"/>
+          <w:bCs w:val="0"/>
           <w:i w:val="0"/>
+          <w:iCs w:val="0"/>
           <w:smallCaps w:val="0"/>
           <w:strike w:val="0"/>
           <w:color w:val="156082"/>
@@ -224,7 +238,9 @@
         <w:rPr>
           <w:rFonts w:ascii="Aptos" w:cs="Aptos" w:eastAsia="Aptos" w:hAnsi="Aptos"/>
           <w:b w:val="0"/>
+          <w:bCs w:val="0"/>
           <w:i w:val="0"/>
+          <w:iCs w:val="0"/>
           <w:smallCaps w:val="0"/>
           <w:strike w:val="0"/>
           <w:color w:val="156082"/>
@@ -501,7 +517,9 @@
         <w:rPr>
           <w:rFonts w:ascii="Aptos" w:cs="Aptos" w:eastAsia="Aptos" w:hAnsi="Aptos"/>
           <w:b w:val="0"/>
+          <w:bCs w:val="0"/>
           <w:i w:val="0"/>
+          <w:iCs w:val="0"/>
           <w:smallCaps w:val="0"/>
           <w:strike w:val="0"/>
           <w:color w:val="156082"/>
@@ -515,12 +533,12 @@
           <wp:inline distB="0" distT="0" distL="0" distR="0">
             <wp:extent cx="758952" cy="478932"/>
             <wp:effectExtent b="0" l="0" r="0" t="0"/>
-            <wp:docPr id="147" name="image2.png"/>
+            <wp:docPr id="147" name="image1.png"/>
             <a:graphic>
               <a:graphicData uri="http://schemas.openxmlformats.org/drawingml/2006/picture">
                 <pic:pic>
                   <pic:nvPicPr>
-                    <pic:cNvPr id="0" name="image2.png"/>
+                    <pic:cNvPr id="0" name="image1.png"/>
                     <pic:cNvPicPr preferRelativeResize="0"/>
                   </pic:nvPicPr>
                   <pic:blipFill>
@@ -555,6 +573,7 @@
         <w:rPr>
           <w:rFonts w:ascii="Arial" w:cs="Arial" w:eastAsia="Arial" w:hAnsi="Arial"/>
           <w:b w:val="1"/>
+          <w:bCs w:val="1"/>
           <w:sz w:val="36"/>
           <w:szCs w:val="36"/>
         </w:rPr>
@@ -588,7 +607,9 @@
         <w:rPr>
           <w:rFonts w:ascii="Play" w:cs="Play" w:eastAsia="Play" w:hAnsi="Play"/>
           <w:b w:val="0"/>
+          <w:bCs w:val="0"/>
           <w:i w:val="0"/>
+          <w:iCs w:val="0"/>
           <w:smallCaps w:val="0"/>
           <w:strike w:val="0"/>
           <w:color w:val="0f4761"/>
@@ -603,7 +624,9 @@
         <w:rPr>
           <w:rFonts w:ascii="Play" w:cs="Play" w:eastAsia="Play" w:hAnsi="Play"/>
           <w:b w:val="0"/>
+          <w:bCs w:val="0"/>
           <w:i w:val="0"/>
+          <w:iCs w:val="0"/>
           <w:smallCaps w:val="0"/>
           <w:strike w:val="0"/>
           <w:color w:val="0f4761"/>
@@ -619,7 +642,7 @@
     </w:p>
     <w:sdt>
       <w:sdtPr>
-        <w:id w:val="-309202634"/>
+        <w:id w:val="191335924"/>
         <w:docPartObj>
           <w:docPartGallery w:val="Table of Contents"/>
           <w:docPartUnique w:val="1"/>
@@ -649,7 +672,9 @@
             <w:rPr>
               <w:rFonts w:ascii="Aptos" w:cs="Aptos" w:eastAsia="Aptos" w:hAnsi="Aptos"/>
               <w:b w:val="0"/>
+              <w:bCs w:val="0"/>
               <w:i w:val="0"/>
+              <w:iCs w:val="0"/>
               <w:smallCaps w:val="0"/>
               <w:strike w:val="0"/>
               <w:color w:val="000000"/>
@@ -670,7 +695,9 @@
               <w:rPr>
                 <w:rFonts w:ascii="Aptos" w:cs="Aptos" w:eastAsia="Aptos" w:hAnsi="Aptos"/>
                 <w:b w:val="0"/>
+                <w:bCs w:val="0"/>
                 <w:i w:val="0"/>
+                <w:iCs w:val="0"/>
                 <w:smallCaps w:val="0"/>
                 <w:strike w:val="0"/>
                 <w:color w:val="000000"/>
@@ -715,7 +742,9 @@
             <w:rPr>
               <w:rFonts w:ascii="Aptos" w:cs="Aptos" w:eastAsia="Aptos" w:hAnsi="Aptos"/>
               <w:b w:val="0"/>
+              <w:bCs w:val="0"/>
               <w:i w:val="0"/>
+              <w:iCs w:val="0"/>
               <w:smallCaps w:val="0"/>
               <w:strike w:val="0"/>
               <w:color w:val="000000"/>
@@ -731,7 +760,9 @@
               <w:rPr>
                 <w:rFonts w:ascii="Aptos" w:cs="Aptos" w:eastAsia="Aptos" w:hAnsi="Aptos"/>
                 <w:b w:val="0"/>
+                <w:bCs w:val="0"/>
                 <w:i w:val="0"/>
+                <w:iCs w:val="0"/>
                 <w:smallCaps w:val="0"/>
                 <w:strike w:val="0"/>
                 <w:color w:val="000000"/>
@@ -776,7 +807,9 @@
             <w:rPr>
               <w:rFonts w:ascii="Aptos" w:cs="Aptos" w:eastAsia="Aptos" w:hAnsi="Aptos"/>
               <w:b w:val="0"/>
+              <w:bCs w:val="0"/>
               <w:i w:val="0"/>
+              <w:iCs w:val="0"/>
               <w:smallCaps w:val="0"/>
               <w:strike w:val="0"/>
               <w:color w:val="000000"/>
@@ -792,7 +825,9 @@
               <w:rPr>
                 <w:rFonts w:ascii="Aptos" w:cs="Aptos" w:eastAsia="Aptos" w:hAnsi="Aptos"/>
                 <w:b w:val="0"/>
+                <w:bCs w:val="0"/>
                 <w:i w:val="0"/>
+                <w:iCs w:val="0"/>
                 <w:smallCaps w:val="0"/>
                 <w:strike w:val="0"/>
                 <w:color w:val="000000"/>
@@ -837,7 +872,9 @@
             <w:rPr>
               <w:rFonts w:ascii="Aptos" w:cs="Aptos" w:eastAsia="Aptos" w:hAnsi="Aptos"/>
               <w:b w:val="0"/>
+              <w:bCs w:val="0"/>
               <w:i w:val="0"/>
+              <w:iCs w:val="0"/>
               <w:smallCaps w:val="0"/>
               <w:strike w:val="0"/>
               <w:color w:val="000000"/>
@@ -853,7 +890,9 @@
               <w:rPr>
                 <w:rFonts w:ascii="Aptos" w:cs="Aptos" w:eastAsia="Aptos" w:hAnsi="Aptos"/>
                 <w:b w:val="0"/>
+                <w:bCs w:val="0"/>
                 <w:i w:val="0"/>
+                <w:iCs w:val="0"/>
                 <w:smallCaps w:val="0"/>
                 <w:strike w:val="0"/>
                 <w:color w:val="000000"/>
@@ -898,7 +937,9 @@
             <w:rPr>
               <w:rFonts w:ascii="Aptos" w:cs="Aptos" w:eastAsia="Aptos" w:hAnsi="Aptos"/>
               <w:b w:val="0"/>
+              <w:bCs w:val="0"/>
               <w:i w:val="0"/>
+              <w:iCs w:val="0"/>
               <w:smallCaps w:val="0"/>
               <w:strike w:val="0"/>
               <w:color w:val="000000"/>
@@ -914,7 +955,9 @@
               <w:rPr>
                 <w:rFonts w:ascii="Aptos" w:cs="Aptos" w:eastAsia="Aptos" w:hAnsi="Aptos"/>
                 <w:b w:val="0"/>
+                <w:bCs w:val="0"/>
                 <w:i w:val="0"/>
+                <w:iCs w:val="0"/>
                 <w:smallCaps w:val="0"/>
                 <w:strike w:val="0"/>
                 <w:color w:val="000000"/>
@@ -959,7 +1002,9 @@
             <w:rPr>
               <w:rFonts w:ascii="Aptos" w:cs="Aptos" w:eastAsia="Aptos" w:hAnsi="Aptos"/>
               <w:b w:val="0"/>
+              <w:bCs w:val="0"/>
               <w:i w:val="0"/>
+              <w:iCs w:val="0"/>
               <w:smallCaps w:val="0"/>
               <w:strike w:val="0"/>
               <w:color w:val="000000"/>
@@ -975,7 +1020,9 @@
               <w:rPr>
                 <w:rFonts w:ascii="Aptos" w:cs="Aptos" w:eastAsia="Aptos" w:hAnsi="Aptos"/>
                 <w:b w:val="0"/>
+                <w:bCs w:val="0"/>
                 <w:i w:val="0"/>
+                <w:iCs w:val="0"/>
                 <w:smallCaps w:val="0"/>
                 <w:strike w:val="0"/>
                 <w:color w:val="000000"/>
@@ -1020,7 +1067,9 @@
             <w:rPr>
               <w:rFonts w:ascii="Aptos" w:cs="Aptos" w:eastAsia="Aptos" w:hAnsi="Aptos"/>
               <w:b w:val="0"/>
+              <w:bCs w:val="0"/>
               <w:i w:val="0"/>
+              <w:iCs w:val="0"/>
               <w:smallCaps w:val="0"/>
               <w:strike w:val="0"/>
               <w:color w:val="000000"/>
@@ -1036,7 +1085,9 @@
               <w:rPr>
                 <w:rFonts w:ascii="Aptos" w:cs="Aptos" w:eastAsia="Aptos" w:hAnsi="Aptos"/>
                 <w:b w:val="0"/>
+                <w:bCs w:val="0"/>
                 <w:i w:val="0"/>
+                <w:iCs w:val="0"/>
                 <w:smallCaps w:val="0"/>
                 <w:strike w:val="0"/>
                 <w:color w:val="000000"/>
@@ -1081,7 +1132,9 @@
             <w:rPr>
               <w:rFonts w:ascii="Aptos" w:cs="Aptos" w:eastAsia="Aptos" w:hAnsi="Aptos"/>
               <w:b w:val="0"/>
+              <w:bCs w:val="0"/>
               <w:i w:val="0"/>
+              <w:iCs w:val="0"/>
               <w:smallCaps w:val="0"/>
               <w:strike w:val="0"/>
               <w:color w:val="000000"/>
@@ -1097,7 +1150,9 @@
               <w:rPr>
                 <w:rFonts w:ascii="Aptos" w:cs="Aptos" w:eastAsia="Aptos" w:hAnsi="Aptos"/>
                 <w:b w:val="0"/>
+                <w:bCs w:val="0"/>
                 <w:i w:val="0"/>
+                <w:iCs w:val="0"/>
                 <w:smallCaps w:val="0"/>
                 <w:strike w:val="0"/>
                 <w:color w:val="000000"/>
@@ -1116,7 +1171,9 @@
               <w:rPr>
                 <w:rFonts w:ascii="Trebuchet MS" w:cs="Trebuchet MS" w:eastAsia="Trebuchet MS" w:hAnsi="Trebuchet MS"/>
                 <w:b w:val="1"/>
+                <w:bCs w:val="1"/>
                 <w:i w:val="0"/>
+                <w:iCs w:val="0"/>
                 <w:smallCaps w:val="0"/>
                 <w:strike w:val="0"/>
                 <w:color w:val="000000"/>
@@ -1135,7 +1192,9 @@
               <w:rPr>
                 <w:rFonts w:ascii="Aptos" w:cs="Aptos" w:eastAsia="Aptos" w:hAnsi="Aptos"/>
                 <w:b w:val="0"/>
+                <w:bCs w:val="0"/>
                 <w:i w:val="0"/>
+                <w:iCs w:val="0"/>
                 <w:smallCaps w:val="0"/>
                 <w:strike w:val="0"/>
                 <w:color w:val="000000"/>
@@ -1180,7 +1239,9 @@
             <w:rPr>
               <w:rFonts w:ascii="Aptos" w:cs="Aptos" w:eastAsia="Aptos" w:hAnsi="Aptos"/>
               <w:b w:val="0"/>
+              <w:bCs w:val="0"/>
               <w:i w:val="0"/>
+              <w:iCs w:val="0"/>
               <w:smallCaps w:val="0"/>
               <w:strike w:val="0"/>
               <w:color w:val="000000"/>
@@ -1196,7 +1257,9 @@
               <w:rPr>
                 <w:rFonts w:ascii="Aptos" w:cs="Aptos" w:eastAsia="Aptos" w:hAnsi="Aptos"/>
                 <w:b w:val="0"/>
+                <w:bCs w:val="0"/>
                 <w:i w:val="0"/>
+                <w:iCs w:val="0"/>
                 <w:smallCaps w:val="0"/>
                 <w:strike w:val="0"/>
                 <w:color w:val="000000"/>
@@ -1241,7 +1304,9 @@
             <w:rPr>
               <w:rFonts w:ascii="Aptos" w:cs="Aptos" w:eastAsia="Aptos" w:hAnsi="Aptos"/>
               <w:b w:val="0"/>
+              <w:bCs w:val="0"/>
               <w:i w:val="0"/>
+              <w:iCs w:val="0"/>
               <w:smallCaps w:val="0"/>
               <w:strike w:val="0"/>
               <w:color w:val="000000"/>
@@ -1257,7 +1322,9 @@
               <w:rPr>
                 <w:rFonts w:ascii="Aptos" w:cs="Aptos" w:eastAsia="Aptos" w:hAnsi="Aptos"/>
                 <w:b w:val="0"/>
+                <w:bCs w:val="0"/>
                 <w:i w:val="0"/>
+                <w:iCs w:val="0"/>
                 <w:smallCaps w:val="0"/>
                 <w:strike w:val="0"/>
                 <w:color w:val="000000"/>
@@ -1302,7 +1369,9 @@
             <w:rPr>
               <w:rFonts w:ascii="Aptos" w:cs="Aptos" w:eastAsia="Aptos" w:hAnsi="Aptos"/>
               <w:b w:val="0"/>
+              <w:bCs w:val="0"/>
               <w:i w:val="0"/>
+              <w:iCs w:val="0"/>
               <w:smallCaps w:val="0"/>
               <w:strike w:val="0"/>
               <w:color w:val="000000"/>
@@ -1318,7 +1387,9 @@
               <w:rPr>
                 <w:rFonts w:ascii="Aptos" w:cs="Aptos" w:eastAsia="Aptos" w:hAnsi="Aptos"/>
                 <w:b w:val="0"/>
+                <w:bCs w:val="0"/>
                 <w:i w:val="0"/>
+                <w:iCs w:val="0"/>
                 <w:smallCaps w:val="0"/>
                 <w:strike w:val="0"/>
                 <w:color w:val="000000"/>
@@ -1363,7 +1434,9 @@
             <w:rPr>
               <w:rFonts w:ascii="Aptos" w:cs="Aptos" w:eastAsia="Aptos" w:hAnsi="Aptos"/>
               <w:b w:val="0"/>
+              <w:bCs w:val="0"/>
               <w:i w:val="0"/>
+              <w:iCs w:val="0"/>
               <w:smallCaps w:val="0"/>
               <w:strike w:val="0"/>
               <w:color w:val="000000"/>
@@ -1379,7 +1452,9 @@
               <w:rPr>
                 <w:rFonts w:ascii="Aptos" w:cs="Aptos" w:eastAsia="Aptos" w:hAnsi="Aptos"/>
                 <w:b w:val="0"/>
+                <w:bCs w:val="0"/>
                 <w:i w:val="0"/>
+                <w:iCs w:val="0"/>
                 <w:smallCaps w:val="0"/>
                 <w:strike w:val="0"/>
                 <w:color w:val="000000"/>
@@ -1424,7 +1499,9 @@
             <w:rPr>
               <w:rFonts w:ascii="Aptos" w:cs="Aptos" w:eastAsia="Aptos" w:hAnsi="Aptos"/>
               <w:b w:val="0"/>
+              <w:bCs w:val="0"/>
               <w:i w:val="0"/>
+              <w:iCs w:val="0"/>
               <w:smallCaps w:val="0"/>
               <w:strike w:val="0"/>
               <w:color w:val="000000"/>
@@ -1440,7 +1517,9 @@
               <w:rPr>
                 <w:rFonts w:ascii="Aptos" w:cs="Aptos" w:eastAsia="Aptos" w:hAnsi="Aptos"/>
                 <w:b w:val="0"/>
+                <w:bCs w:val="0"/>
                 <w:i w:val="0"/>
+                <w:iCs w:val="0"/>
                 <w:smallCaps w:val="0"/>
                 <w:strike w:val="0"/>
                 <w:color w:val="000000"/>
@@ -1485,7 +1564,9 @@
             <w:rPr>
               <w:rFonts w:ascii="Aptos" w:cs="Aptos" w:eastAsia="Aptos" w:hAnsi="Aptos"/>
               <w:b w:val="0"/>
+              <w:bCs w:val="0"/>
               <w:i w:val="0"/>
+              <w:iCs w:val="0"/>
               <w:smallCaps w:val="0"/>
               <w:strike w:val="0"/>
               <w:color w:val="000000"/>
@@ -1501,7 +1582,9 @@
               <w:rPr>
                 <w:rFonts w:ascii="Aptos" w:cs="Aptos" w:eastAsia="Aptos" w:hAnsi="Aptos"/>
                 <w:b w:val="0"/>
+                <w:bCs w:val="0"/>
                 <w:i w:val="0"/>
+                <w:iCs w:val="0"/>
                 <w:smallCaps w:val="0"/>
                 <w:strike w:val="0"/>
                 <w:color w:val="000000"/>
@@ -1546,7 +1629,9 @@
             <w:rPr>
               <w:rFonts w:ascii="Aptos" w:cs="Aptos" w:eastAsia="Aptos" w:hAnsi="Aptos"/>
               <w:b w:val="0"/>
+              <w:bCs w:val="0"/>
               <w:i w:val="0"/>
+              <w:iCs w:val="0"/>
               <w:smallCaps w:val="0"/>
               <w:strike w:val="0"/>
               <w:color w:val="000000"/>
@@ -1562,7 +1647,9 @@
               <w:rPr>
                 <w:rFonts w:ascii="Aptos" w:cs="Aptos" w:eastAsia="Aptos" w:hAnsi="Aptos"/>
                 <w:b w:val="0"/>
+                <w:bCs w:val="0"/>
                 <w:i w:val="0"/>
+                <w:iCs w:val="0"/>
                 <w:smallCaps w:val="0"/>
                 <w:strike w:val="0"/>
                 <w:color w:val="000000"/>
@@ -1607,7 +1694,9 @@
             <w:rPr>
               <w:rFonts w:ascii="Aptos" w:cs="Aptos" w:eastAsia="Aptos" w:hAnsi="Aptos"/>
               <w:b w:val="0"/>
+              <w:bCs w:val="0"/>
               <w:i w:val="0"/>
+              <w:iCs w:val="0"/>
               <w:smallCaps w:val="0"/>
               <w:strike w:val="0"/>
               <w:color w:val="000000"/>
@@ -1623,7 +1712,9 @@
               <w:rPr>
                 <w:rFonts w:ascii="Aptos" w:cs="Aptos" w:eastAsia="Aptos" w:hAnsi="Aptos"/>
                 <w:b w:val="0"/>
+                <w:bCs w:val="0"/>
                 <w:i w:val="0"/>
+                <w:iCs w:val="0"/>
                 <w:smallCaps w:val="0"/>
                 <w:strike w:val="0"/>
                 <w:color w:val="000000"/>
@@ -2041,7 +2132,9 @@
         <w:rPr>
           <w:rFonts w:ascii="Arial" w:cs="Arial" w:eastAsia="Arial" w:hAnsi="Arial"/>
           <w:b w:val="0"/>
+          <w:bCs w:val="0"/>
           <w:i w:val="0"/>
+          <w:iCs w:val="0"/>
           <w:smallCaps w:val="0"/>
           <w:strike w:val="0"/>
           <w:color w:val="000000"/>
@@ -2056,7 +2149,9 @@
         <w:rPr>
           <w:rFonts w:ascii="Arial" w:cs="Arial" w:eastAsia="Arial" w:hAnsi="Arial"/>
           <w:b w:val="0"/>
+          <w:bCs w:val="0"/>
           <w:i w:val="0"/>
+          <w:iCs w:val="0"/>
           <w:smallCaps w:val="0"/>
           <w:strike w:val="0"/>
           <w:color w:val="000000"/>
@@ -2094,7 +2189,9 @@
         <w:rPr>
           <w:rFonts w:ascii="Arial" w:cs="Arial" w:eastAsia="Arial" w:hAnsi="Arial"/>
           <w:b w:val="0"/>
+          <w:bCs w:val="0"/>
           <w:i w:val="0"/>
+          <w:iCs w:val="0"/>
           <w:smallCaps w:val="0"/>
           <w:strike w:val="0"/>
           <w:color w:val="000000"/>
@@ -2109,7 +2206,9 @@
         <w:rPr>
           <w:rFonts w:ascii="Arial" w:cs="Arial" w:eastAsia="Arial" w:hAnsi="Arial"/>
           <w:b w:val="0"/>
+          <w:bCs w:val="0"/>
           <w:i w:val="0"/>
+          <w:iCs w:val="0"/>
           <w:smallCaps w:val="0"/>
           <w:strike w:val="0"/>
           <w:color w:val="000000"/>
@@ -2147,7 +2246,9 @@
         <w:rPr>
           <w:rFonts w:ascii="Arial" w:cs="Arial" w:eastAsia="Arial" w:hAnsi="Arial"/>
           <w:b w:val="0"/>
+          <w:bCs w:val="0"/>
           <w:i w:val="0"/>
+          <w:iCs w:val="0"/>
           <w:smallCaps w:val="0"/>
           <w:strike w:val="0"/>
           <w:color w:val="000000"/>
@@ -2162,7 +2263,9 @@
         <w:rPr>
           <w:rFonts w:ascii="Arial" w:cs="Arial" w:eastAsia="Arial" w:hAnsi="Arial"/>
           <w:b w:val="0"/>
+          <w:bCs w:val="0"/>
           <w:i w:val="0"/>
+          <w:iCs w:val="0"/>
           <w:smallCaps w:val="0"/>
           <w:strike w:val="0"/>
           <w:color w:val="000000"/>
@@ -2200,7 +2303,9 @@
         <w:rPr>
           <w:rFonts w:ascii="Arial" w:cs="Arial" w:eastAsia="Arial" w:hAnsi="Arial"/>
           <w:b w:val="0"/>
+          <w:bCs w:val="0"/>
           <w:i w:val="0"/>
+          <w:iCs w:val="0"/>
           <w:smallCaps w:val="0"/>
           <w:strike w:val="0"/>
           <w:color w:val="000000"/>
@@ -2215,7 +2320,9 @@
         <w:rPr>
           <w:rFonts w:ascii="Arial" w:cs="Arial" w:eastAsia="Arial" w:hAnsi="Arial"/>
           <w:b w:val="0"/>
+          <w:bCs w:val="0"/>
           <w:i w:val="0"/>
+          <w:iCs w:val="0"/>
           <w:smallCaps w:val="0"/>
           <w:strike w:val="0"/>
           <w:color w:val="000000"/>
@@ -2253,7 +2360,9 @@
         <w:rPr>
           <w:rFonts w:ascii="Arial" w:cs="Arial" w:eastAsia="Arial" w:hAnsi="Arial"/>
           <w:b w:val="0"/>
+          <w:bCs w:val="0"/>
           <w:i w:val="0"/>
+          <w:iCs w:val="0"/>
           <w:smallCaps w:val="0"/>
           <w:strike w:val="0"/>
           <w:color w:val="000000"/>
@@ -2268,7 +2377,9 @@
         <w:rPr>
           <w:rFonts w:ascii="Arial" w:cs="Arial" w:eastAsia="Arial" w:hAnsi="Arial"/>
           <w:b w:val="0"/>
+          <w:bCs w:val="0"/>
           <w:i w:val="0"/>
+          <w:iCs w:val="0"/>
           <w:smallCaps w:val="0"/>
           <w:strike w:val="0"/>
           <w:color w:val="000000"/>
@@ -2306,7 +2417,9 @@
         <w:rPr>
           <w:rFonts w:ascii="Arial" w:cs="Arial" w:eastAsia="Arial" w:hAnsi="Arial"/>
           <w:b w:val="0"/>
+          <w:bCs w:val="0"/>
           <w:i w:val="0"/>
+          <w:iCs w:val="0"/>
           <w:smallCaps w:val="0"/>
           <w:strike w:val="0"/>
           <w:color w:val="000000"/>
@@ -2321,7 +2434,9 @@
         <w:rPr>
           <w:rFonts w:ascii="Arial" w:cs="Arial" w:eastAsia="Arial" w:hAnsi="Arial"/>
           <w:b w:val="0"/>
+          <w:bCs w:val="0"/>
           <w:i w:val="0"/>
+          <w:iCs w:val="0"/>
           <w:smallCaps w:val="0"/>
           <w:strike w:val="0"/>
           <w:color w:val="000000"/>
@@ -2359,7 +2474,9 @@
         <w:rPr>
           <w:rFonts w:ascii="Arial" w:cs="Arial" w:eastAsia="Arial" w:hAnsi="Arial"/>
           <w:b w:val="0"/>
+          <w:bCs w:val="0"/>
           <w:i w:val="0"/>
+          <w:iCs w:val="0"/>
           <w:smallCaps w:val="0"/>
           <w:strike w:val="0"/>
           <w:color w:val="000000"/>
@@ -2374,7 +2491,9 @@
         <w:rPr>
           <w:rFonts w:ascii="Arial" w:cs="Arial" w:eastAsia="Arial" w:hAnsi="Arial"/>
           <w:b w:val="0"/>
+          <w:bCs w:val="0"/>
           <w:i w:val="0"/>
+          <w:iCs w:val="0"/>
           <w:smallCaps w:val="0"/>
           <w:strike w:val="0"/>
           <w:color w:val="000000"/>
@@ -2479,7 +2598,7 @@
           <w:rFonts w:ascii="Arial" w:cs="Arial" w:eastAsia="Arial" w:hAnsi="Arial"/>
           <w:rtl w:val="0"/>
         </w:rPr>
-        <w:t xml:space="preserve">Para el desarrollo del sistema se utilizarán herramientas de software que garanticen eficiencia, escalabilidad y facilidad de integración. El backend y la lógica principal del sistema se implementarán en C# (C Sharp), mientras que el entorno de programación seleccionado será Visual Studio Code, debido a su ligereza, flexibilidad y amplia compatibilidad con extensiones de desarrollo modernas. Además, se hará uso de software complementario como Arduino IDE para la programación inicial de microcontroladores y Firebase/Node-RED para la gestión de datos en tiempo real y la integración con la nube, tal como se describe en el documento de costos del proyecto.</w:t>
+        <w:t xml:space="preserve">Para el desarrollo del sistema se utilizarán herramientas de software que garanticen eficiencia, escalabilidad y facilidad de integración. El backend y la lógica principal del sistema se implementarán en Java usando el framework Spring Boot, mientras que el entorno de programación seleccionado será Visual Studio Code, debido a su ligereza, flexibilidad y amplia compatibilidad con extensiones de desarrollo modernas. Además, se hará uso de software complementario como Firebase/Node-RED para la gestión de datos en tiempo real y la integración con la nube, tal como se describe en el documento de costos del proyecto.</w:t>
       </w:r>
     </w:p>
     <w:p>
@@ -2576,6 +2695,7 @@
         <w:rPr>
           <w:rFonts w:ascii="Trebuchet MS" w:cs="Trebuchet MS" w:eastAsia="Trebuchet MS" w:hAnsi="Trebuchet MS"/>
           <w:b w:val="1"/>
+          <w:bCs w:val="1"/>
           <w:color w:val="000000"/>
           <w:sz w:val="23"/>
           <w:szCs w:val="23"/>
@@ -2635,6 +2755,7 @@
               <w:rPr>
                 <w:rFonts w:ascii="Calibri" w:cs="Calibri" w:eastAsia="Calibri" w:hAnsi="Calibri"/>
                 <w:b w:val="1"/>
+                <w:bCs w:val="1"/>
                 <w:color w:val="000000"/>
                 <w:sz w:val="22"/>
                 <w:szCs w:val="22"/>
@@ -2644,6 +2765,7 @@
               <w:rPr>
                 <w:rFonts w:ascii="Calibri" w:cs="Calibri" w:eastAsia="Calibri" w:hAnsi="Calibri"/>
                 <w:b w:val="1"/>
+                <w:bCs w:val="1"/>
                 <w:color w:val="000000"/>
                 <w:sz w:val="22"/>
                 <w:szCs w:val="22"/>
@@ -2670,6 +2792,7 @@
               <w:rPr>
                 <w:rFonts w:ascii="Calibri" w:cs="Calibri" w:eastAsia="Calibri" w:hAnsi="Calibri"/>
                 <w:b w:val="1"/>
+                <w:bCs w:val="1"/>
                 <w:color w:val="000000"/>
                 <w:sz w:val="22"/>
                 <w:szCs w:val="22"/>
@@ -2679,6 +2802,7 @@
               <w:rPr>
                 <w:rFonts w:ascii="Calibri" w:cs="Calibri" w:eastAsia="Calibri" w:hAnsi="Calibri"/>
                 <w:b w:val="1"/>
+                <w:bCs w:val="1"/>
                 <w:color w:val="000000"/>
                 <w:sz w:val="22"/>
                 <w:szCs w:val="22"/>
@@ -2705,6 +2829,7 @@
               <w:rPr>
                 <w:rFonts w:ascii="Calibri" w:cs="Calibri" w:eastAsia="Calibri" w:hAnsi="Calibri"/>
                 <w:b w:val="1"/>
+                <w:bCs w:val="1"/>
                 <w:color w:val="000000"/>
                 <w:sz w:val="22"/>
                 <w:szCs w:val="22"/>
@@ -2714,6 +2839,7 @@
               <w:rPr>
                 <w:rFonts w:ascii="Calibri" w:cs="Calibri" w:eastAsia="Calibri" w:hAnsi="Calibri"/>
                 <w:b w:val="1"/>
+                <w:bCs w:val="1"/>
                 <w:color w:val="000000"/>
                 <w:sz w:val="22"/>
                 <w:szCs w:val="22"/>
@@ -2740,6 +2866,7 @@
               <w:rPr>
                 <w:rFonts w:ascii="Calibri" w:cs="Calibri" w:eastAsia="Calibri" w:hAnsi="Calibri"/>
                 <w:b w:val="1"/>
+                <w:bCs w:val="1"/>
                 <w:color w:val="000000"/>
                 <w:sz w:val="22"/>
                 <w:szCs w:val="22"/>
@@ -2749,6 +2876,7 @@
               <w:rPr>
                 <w:rFonts w:ascii="Calibri" w:cs="Calibri" w:eastAsia="Calibri" w:hAnsi="Calibri"/>
                 <w:b w:val="1"/>
+                <w:bCs w:val="1"/>
                 <w:color w:val="000000"/>
                 <w:sz w:val="22"/>
                 <w:szCs w:val="22"/>
@@ -2781,6 +2909,7 @@
               <w:rPr>
                 <w:rFonts w:ascii="Calibri" w:cs="Calibri" w:eastAsia="Calibri" w:hAnsi="Calibri"/>
                 <w:b w:val="1"/>
+                <w:bCs w:val="1"/>
                 <w:color w:val="000000"/>
                 <w:sz w:val="22"/>
                 <w:szCs w:val="22"/>
@@ -2790,6 +2919,7 @@
               <w:rPr>
                 <w:rFonts w:ascii="Calibri" w:cs="Calibri" w:eastAsia="Calibri" w:hAnsi="Calibri"/>
                 <w:b w:val="1"/>
+                <w:bCs w:val="1"/>
                 <w:color w:val="000000"/>
                 <w:sz w:val="22"/>
                 <w:szCs w:val="22"/>
@@ -2897,6 +3027,7 @@
               <w:rPr>
                 <w:rFonts w:ascii="Calibri" w:cs="Calibri" w:eastAsia="Calibri" w:hAnsi="Calibri"/>
                 <w:i w:val="1"/>
+                <w:iCs w:val="1"/>
                 <w:color w:val="000000"/>
                 <w:sz w:val="22"/>
                 <w:szCs w:val="22"/>
@@ -2939,6 +3070,7 @@
               <w:rPr>
                 <w:rFonts w:ascii="Calibri" w:cs="Calibri" w:eastAsia="Calibri" w:hAnsi="Calibri"/>
                 <w:b w:val="1"/>
+                <w:bCs w:val="1"/>
                 <w:color w:val="000000"/>
                 <w:sz w:val="22"/>
                 <w:szCs w:val="22"/>
@@ -2948,6 +3080,7 @@
               <w:rPr>
                 <w:rFonts w:ascii="Calibri" w:cs="Calibri" w:eastAsia="Calibri" w:hAnsi="Calibri"/>
                 <w:b w:val="1"/>
+                <w:bCs w:val="1"/>
                 <w:sz w:val="22"/>
                 <w:szCs w:val="22"/>
                 <w:rtl w:val="0"/>
@@ -3080,6 +3213,7 @@
               <w:rPr>
                 <w:rFonts w:ascii="Calibri" w:cs="Calibri" w:eastAsia="Calibri" w:hAnsi="Calibri"/>
                 <w:b w:val="1"/>
+                <w:bCs w:val="1"/>
                 <w:color w:val="000000"/>
                 <w:sz w:val="22"/>
                 <w:szCs w:val="22"/>
@@ -3089,6 +3223,7 @@
               <w:rPr>
                 <w:rFonts w:ascii="Calibri" w:cs="Calibri" w:eastAsia="Calibri" w:hAnsi="Calibri"/>
                 <w:b w:val="1"/>
+                <w:bCs w:val="1"/>
                 <w:color w:val="000000"/>
                 <w:sz w:val="22"/>
                 <w:szCs w:val="22"/>
@@ -3408,7 +3543,9 @@
         <w:rPr>
           <w:rFonts w:ascii="Arial" w:cs="Arial" w:eastAsia="Arial" w:hAnsi="Arial"/>
           <w:b w:val="0"/>
+          <w:bCs w:val="0"/>
           <w:i w:val="0"/>
+          <w:iCs w:val="0"/>
           <w:smallCaps w:val="0"/>
           <w:strike w:val="0"/>
           <w:color w:val="000000"/>
@@ -3423,7 +3560,9 @@
         <w:rPr>
           <w:rFonts w:ascii="Arial" w:cs="Arial" w:eastAsia="Arial" w:hAnsi="Arial"/>
           <w:b w:val="0"/>
+          <w:bCs w:val="0"/>
           <w:i w:val="0"/>
+          <w:iCs w:val="0"/>
           <w:smallCaps w:val="0"/>
           <w:strike w:val="0"/>
           <w:color w:val="000000"/>
@@ -3461,7 +3600,9 @@
         <w:rPr>
           <w:rFonts w:ascii="Arial" w:cs="Arial" w:eastAsia="Arial" w:hAnsi="Arial"/>
           <w:b w:val="0"/>
+          <w:bCs w:val="0"/>
           <w:i w:val="0"/>
+          <w:iCs w:val="0"/>
           <w:smallCaps w:val="0"/>
           <w:strike w:val="0"/>
           <w:color w:val="000000"/>
@@ -3476,7 +3617,9 @@
         <w:rPr>
           <w:rFonts w:ascii="Arial" w:cs="Arial" w:eastAsia="Arial" w:hAnsi="Arial"/>
           <w:b w:val="0"/>
+          <w:bCs w:val="0"/>
           <w:i w:val="0"/>
+          <w:iCs w:val="0"/>
           <w:smallCaps w:val="0"/>
           <w:strike w:val="0"/>
           <w:color w:val="000000"/>
@@ -3514,7 +3657,9 @@
         <w:rPr>
           <w:rFonts w:ascii="Arial" w:cs="Arial" w:eastAsia="Arial" w:hAnsi="Arial"/>
           <w:b w:val="0"/>
+          <w:bCs w:val="0"/>
           <w:i w:val="0"/>
+          <w:iCs w:val="0"/>
           <w:smallCaps w:val="0"/>
           <w:strike w:val="0"/>
           <w:color w:val="000000"/>
@@ -3529,7 +3674,9 @@
         <w:rPr>
           <w:rFonts w:ascii="Arial" w:cs="Arial" w:eastAsia="Arial" w:hAnsi="Arial"/>
           <w:b w:val="0"/>
+          <w:bCs w:val="0"/>
           <w:i w:val="0"/>
+          <w:iCs w:val="0"/>
           <w:smallCaps w:val="0"/>
           <w:strike w:val="0"/>
           <w:color w:val="000000"/>
@@ -3563,7 +3710,9 @@
         <w:rPr>
           <w:rFonts w:ascii="Arial" w:cs="Arial" w:eastAsia="Arial" w:hAnsi="Arial"/>
           <w:b w:val="0"/>
+          <w:bCs w:val="0"/>
           <w:i w:val="0"/>
+          <w:iCs w:val="0"/>
           <w:smallCaps w:val="0"/>
           <w:strike w:val="0"/>
           <w:color w:val="000000"/>
@@ -3618,7 +3767,9 @@
         <w:rPr>
           <w:rFonts w:ascii="Arial" w:cs="Arial" w:eastAsia="Arial" w:hAnsi="Arial"/>
           <w:b w:val="0"/>
+          <w:bCs w:val="0"/>
           <w:i w:val="0"/>
+          <w:iCs w:val="0"/>
           <w:smallCaps w:val="0"/>
           <w:strike w:val="0"/>
           <w:color w:val="000000"/>
@@ -3633,7 +3784,9 @@
         <w:rPr>
           <w:rFonts w:ascii="Arial" w:cs="Arial" w:eastAsia="Arial" w:hAnsi="Arial"/>
           <w:b w:val="0"/>
+          <w:bCs w:val="0"/>
           <w:i w:val="0"/>
+          <w:iCs w:val="0"/>
           <w:smallCaps w:val="0"/>
           <w:strike w:val="0"/>
           <w:color w:val="000000"/>
@@ -3671,7 +3824,9 @@
         <w:rPr>
           <w:rFonts w:ascii="Arial" w:cs="Arial" w:eastAsia="Arial" w:hAnsi="Arial"/>
           <w:b w:val="0"/>
+          <w:bCs w:val="0"/>
           <w:i w:val="0"/>
+          <w:iCs w:val="0"/>
           <w:smallCaps w:val="0"/>
           <w:strike w:val="0"/>
           <w:color w:val="000000"/>
@@ -3686,7 +3841,9 @@
         <w:rPr>
           <w:rFonts w:ascii="Arial" w:cs="Arial" w:eastAsia="Arial" w:hAnsi="Arial"/>
           <w:b w:val="0"/>
+          <w:bCs w:val="0"/>
           <w:i w:val="0"/>
+          <w:iCs w:val="0"/>
           <w:smallCaps w:val="0"/>
           <w:strike w:val="0"/>
           <w:color w:val="000000"/>
@@ -3724,7 +3881,9 @@
         <w:rPr>
           <w:rFonts w:ascii="Arial" w:cs="Arial" w:eastAsia="Arial" w:hAnsi="Arial"/>
           <w:b w:val="0"/>
+          <w:bCs w:val="0"/>
           <w:i w:val="0"/>
+          <w:iCs w:val="0"/>
           <w:smallCaps w:val="0"/>
           <w:strike w:val="0"/>
           <w:color w:val="000000"/>
@@ -3739,7 +3898,9 @@
         <w:rPr>
           <w:rFonts w:ascii="Arial" w:cs="Arial" w:eastAsia="Arial" w:hAnsi="Arial"/>
           <w:b w:val="0"/>
+          <w:bCs w:val="0"/>
           <w:i w:val="0"/>
+          <w:iCs w:val="0"/>
           <w:smallCaps w:val="0"/>
           <w:strike w:val="0"/>
           <w:color w:val="000000"/>
@@ -3777,7 +3938,9 @@
         <w:rPr>
           <w:rFonts w:ascii="Arial" w:cs="Arial" w:eastAsia="Arial" w:hAnsi="Arial"/>
           <w:b w:val="0"/>
+          <w:bCs w:val="0"/>
           <w:i w:val="0"/>
+          <w:iCs w:val="0"/>
           <w:smallCaps w:val="0"/>
           <w:strike w:val="0"/>
           <w:color w:val="000000"/>
@@ -3792,7 +3955,9 @@
         <w:rPr>
           <w:rFonts w:ascii="Arial" w:cs="Arial" w:eastAsia="Arial" w:hAnsi="Arial"/>
           <w:b w:val="0"/>
+          <w:bCs w:val="0"/>
           <w:i w:val="0"/>
+          <w:iCs w:val="0"/>
           <w:smallCaps w:val="0"/>
           <w:strike w:val="0"/>
           <w:color w:val="000000"/>
@@ -3844,7 +4009,9 @@
         <w:rPr>
           <w:rFonts w:ascii="Arial" w:cs="Arial" w:eastAsia="Arial" w:hAnsi="Arial"/>
           <w:b w:val="0"/>
+          <w:bCs w:val="0"/>
           <w:i w:val="0"/>
+          <w:iCs w:val="0"/>
           <w:smallCaps w:val="0"/>
           <w:strike w:val="0"/>
           <w:color w:val="000000"/>
@@ -3859,7 +4026,9 @@
         <w:rPr>
           <w:rFonts w:ascii="Arial" w:cs="Arial" w:eastAsia="Arial" w:hAnsi="Arial"/>
           <w:b w:val="0"/>
+          <w:bCs w:val="0"/>
           <w:i w:val="0"/>
+          <w:iCs w:val="0"/>
           <w:smallCaps w:val="0"/>
           <w:strike w:val="0"/>
           <w:color w:val="000000"/>
@@ -3897,7 +4066,9 @@
         <w:rPr>
           <w:rFonts w:ascii="Arial" w:cs="Arial" w:eastAsia="Arial" w:hAnsi="Arial"/>
           <w:b w:val="0"/>
+          <w:bCs w:val="0"/>
           <w:i w:val="0"/>
+          <w:iCs w:val="0"/>
           <w:smallCaps w:val="0"/>
           <w:strike w:val="0"/>
           <w:color w:val="000000"/>
@@ -3912,7 +4083,9 @@
         <w:rPr>
           <w:rFonts w:ascii="Arial" w:cs="Arial" w:eastAsia="Arial" w:hAnsi="Arial"/>
           <w:b w:val="0"/>
+          <w:bCs w:val="0"/>
           <w:i w:val="0"/>
+          <w:iCs w:val="0"/>
           <w:smallCaps w:val="0"/>
           <w:strike w:val="0"/>
           <w:color w:val="000000"/>
@@ -3950,7 +4123,9 @@
         <w:rPr>
           <w:rFonts w:ascii="Arial" w:cs="Arial" w:eastAsia="Arial" w:hAnsi="Arial"/>
           <w:b w:val="0"/>
+          <w:bCs w:val="0"/>
           <w:i w:val="0"/>
+          <w:iCs w:val="0"/>
           <w:smallCaps w:val="0"/>
           <w:strike w:val="0"/>
           <w:color w:val="000000"/>
@@ -3965,7 +4140,9 @@
         <w:rPr>
           <w:rFonts w:ascii="Arial" w:cs="Arial" w:eastAsia="Arial" w:hAnsi="Arial"/>
           <w:b w:val="0"/>
+          <w:bCs w:val="0"/>
           <w:i w:val="0"/>
+          <w:iCs w:val="0"/>
           <w:smallCaps w:val="0"/>
           <w:strike w:val="0"/>
           <w:color w:val="000000"/>
@@ -4003,7 +4180,9 @@
         <w:rPr>
           <w:rFonts w:ascii="Arial" w:cs="Arial" w:eastAsia="Arial" w:hAnsi="Arial"/>
           <w:b w:val="0"/>
+          <w:bCs w:val="0"/>
           <w:i w:val="0"/>
+          <w:iCs w:val="0"/>
           <w:smallCaps w:val="0"/>
           <w:strike w:val="0"/>
           <w:color w:val="000000"/>
@@ -4018,7 +4197,9 @@
         <w:rPr>
           <w:rFonts w:ascii="Arial" w:cs="Arial" w:eastAsia="Arial" w:hAnsi="Arial"/>
           <w:b w:val="0"/>
+          <w:bCs w:val="0"/>
           <w:i w:val="0"/>
+          <w:iCs w:val="0"/>
           <w:smallCaps w:val="0"/>
           <w:strike w:val="0"/>
           <w:color w:val="000000"/>
@@ -4142,7 +4323,9 @@
         <w:rPr>
           <w:rFonts w:ascii="Arial" w:cs="Arial" w:eastAsia="Arial" w:hAnsi="Arial"/>
           <w:b w:val="0"/>
+          <w:bCs w:val="0"/>
           <w:i w:val="0"/>
+          <w:iCs w:val="0"/>
           <w:smallCaps w:val="0"/>
           <w:strike w:val="0"/>
           <w:color w:val="000000"/>
@@ -4157,7 +4340,9 @@
         <w:rPr>
           <w:rFonts w:ascii="Arial" w:cs="Arial" w:eastAsia="Arial" w:hAnsi="Arial"/>
           <w:b w:val="0"/>
+          <w:bCs w:val="0"/>
           <w:i w:val="0"/>
+          <w:iCs w:val="0"/>
           <w:smallCaps w:val="0"/>
           <w:strike w:val="0"/>
           <w:color w:val="000000"/>
@@ -4195,7 +4380,9 @@
         <w:rPr>
           <w:rFonts w:ascii="Arial" w:cs="Arial" w:eastAsia="Arial" w:hAnsi="Arial"/>
           <w:b w:val="0"/>
+          <w:bCs w:val="0"/>
           <w:i w:val="0"/>
+          <w:iCs w:val="0"/>
           <w:smallCaps w:val="0"/>
           <w:strike w:val="0"/>
           <w:color w:val="000000"/>
@@ -4210,7 +4397,9 @@
         <w:rPr>
           <w:rFonts w:ascii="Arial" w:cs="Arial" w:eastAsia="Arial" w:hAnsi="Arial"/>
           <w:b w:val="0"/>
+          <w:bCs w:val="0"/>
           <w:i w:val="0"/>
+          <w:iCs w:val="0"/>
           <w:smallCaps w:val="0"/>
           <w:strike w:val="0"/>
           <w:color w:val="000000"/>
@@ -4248,7 +4437,9 @@
         <w:rPr>
           <w:rFonts w:ascii="Arial" w:cs="Arial" w:eastAsia="Arial" w:hAnsi="Arial"/>
           <w:b w:val="0"/>
+          <w:bCs w:val="0"/>
           <w:i w:val="0"/>
+          <w:iCs w:val="0"/>
           <w:smallCaps w:val="0"/>
           <w:strike w:val="0"/>
           <w:color w:val="000000"/>
@@ -4263,7 +4454,9 @@
         <w:rPr>
           <w:rFonts w:ascii="Arial" w:cs="Arial" w:eastAsia="Arial" w:hAnsi="Arial"/>
           <w:b w:val="0"/>
+          <w:bCs w:val="0"/>
           <w:i w:val="0"/>
+          <w:iCs w:val="0"/>
           <w:smallCaps w:val="0"/>
           <w:strike w:val="0"/>
           <w:color w:val="000000"/>
@@ -4301,7 +4494,9 @@
         <w:rPr>
           <w:rFonts w:ascii="Arial" w:cs="Arial" w:eastAsia="Arial" w:hAnsi="Arial"/>
           <w:b w:val="0"/>
+          <w:bCs w:val="0"/>
           <w:i w:val="0"/>
+          <w:iCs w:val="0"/>
           <w:smallCaps w:val="0"/>
           <w:strike w:val="0"/>
           <w:color w:val="000000"/>
@@ -4316,7 +4511,9 @@
         <w:rPr>
           <w:rFonts w:ascii="Arial" w:cs="Arial" w:eastAsia="Arial" w:hAnsi="Arial"/>
           <w:b w:val="0"/>
+          <w:bCs w:val="0"/>
           <w:i w:val="0"/>
+          <w:iCs w:val="0"/>
           <w:smallCaps w:val="0"/>
           <w:strike w:val="0"/>
           <w:color w:val="000000"/>
@@ -5025,6 +5222,7 @@
     </w:pPr>
     <w:rPr>
       <w:i w:val="1"/>
+      <w:iCs w:val="1"/>
       <w:color w:val="0f4761"/>
     </w:rPr>
   </w:style>
@@ -5052,6 +5250,7 @@
     </w:pPr>
     <w:rPr>
       <w:i w:val="1"/>
+      <w:iCs w:val="1"/>
       <w:color w:val="595959"/>
     </w:rPr>
   </w:style>

</xml_diff>